<commit_message>
feat(truscore): Open Pillar v14, ethics field rename, spec updates
Open Pillar (food MVP, Open_Scoring_Specification_v14):
- Add openPillarHiddenTerms: tokenized matching, phrase lists, E/INS codes,
  guardrails (e.g. vanilla extract, opaque additive parens)
- Penalties 1/2/3+ hits: -4 / -8 / -11; NOVA listing clarity +4 (1-2) / +2 (3-4)
- Remove brand/parent transparency scoring from Open pillar

Ethics naming (replaces legacy CARE in code):
- TrustScoreBreakdown.care -> ethics; update services, UI, Vercel preview,
  analysis scripts, and npm test:pillar:ethics

Tests: openPillar + ethicsPillar unit tests; e2e Open cases aligned to v14

Also: BBFAW/ethics data and spec document changes in repo tree.
Made-with: Cursor
</commit_message>
<xml_diff>
--- a/Spec documents/Cross-Pillar_Score_and Commentary_Table_20251222.docx
+++ b/Spec documents/Cross-Pillar_Score_and Commentary_Table_20251222.docx
@@ -19,9 +19,9 @@
         <w:gridCol w:w="1088"/>
         <w:gridCol w:w="2814"/>
         <w:gridCol w:w="477"/>
-        <w:gridCol w:w="976"/>
-        <w:gridCol w:w="5088"/>
-        <w:gridCol w:w="2519"/>
+        <w:gridCol w:w="975"/>
+        <w:gridCol w:w="5084"/>
+        <w:gridCol w:w="2524"/>
         <w:gridCol w:w="2426"/>
       </w:tblGrid>
       <w:tr>
@@ -1104,7 +1104,7 @@
                 <w:lang w:eastAsia="en-GB"/>
                 <w14:ligatures w14:val="none"/>
               </w:rPr>
-              <w:t xml:space="preserve"> and overall good for your health.</w:t>
+              <w:t xml:space="preserve"> and overall good for health.</w:t>
             </w:r>
           </w:p>
         </w:tc>
@@ -1371,31 +1371,55 @@
                 <w:lang w:eastAsia="en-GB"/>
                 <w14:ligatures w14:val="none"/>
               </w:rPr>
-              <w:t xml:space="preserve">atch </w:t>
-            </w:r>
-            <w:r>
-              <w:rPr>
-                <w:rFonts w:eastAsia="Times New Roman" w:cs="Times New Roman"/>
-                <w:color w:val="000000"/>
-                <w:kern w:val="0"/>
-                <w:sz w:val="15"/>
-                <w:szCs w:val="15"/>
-                <w:lang w:eastAsia="en-GB"/>
-                <w14:ligatures w14:val="none"/>
-              </w:rPr>
-              <w:t xml:space="preserve">your </w:t>
-            </w:r>
-            <w:r>
-              <w:rPr>
-                <w:rFonts w:eastAsia="Times New Roman" w:cs="Times New Roman"/>
-                <w:color w:val="000000"/>
-                <w:kern w:val="0"/>
-                <w:sz w:val="15"/>
-                <w:szCs w:val="15"/>
-                <w:lang w:eastAsia="en-GB"/>
-                <w14:ligatures w14:val="none"/>
-              </w:rPr>
-              <w:t>portions.</w:t>
+              <w:t>atch</w:t>
+            </w:r>
+            <w:r>
+              <w:rPr>
+                <w:rFonts w:eastAsia="Times New Roman" w:cs="Times New Roman"/>
+                <w:color w:val="000000"/>
+                <w:kern w:val="0"/>
+                <w:sz w:val="15"/>
+                <w:szCs w:val="15"/>
+                <w:lang w:eastAsia="en-GB"/>
+                <w14:ligatures w14:val="none"/>
+              </w:rPr>
+              <w:t xml:space="preserve"> </w:t>
+            </w:r>
+            <w:r>
+              <w:rPr>
+                <w:rFonts w:eastAsia="Times New Roman" w:cs="Times New Roman"/>
+                <w:color w:val="000000"/>
+                <w:kern w:val="0"/>
+                <w:sz w:val="15"/>
+                <w:szCs w:val="15"/>
+                <w:lang w:eastAsia="en-GB"/>
+                <w14:ligatures w14:val="none"/>
+              </w:rPr>
+              <w:t>portion</w:t>
+            </w:r>
+            <w:r>
+              <w:rPr>
+                <w:rFonts w:eastAsia="Times New Roman" w:cs="Times New Roman"/>
+                <w:color w:val="000000"/>
+                <w:kern w:val="0"/>
+                <w:sz w:val="15"/>
+                <w:szCs w:val="15"/>
+                <w:lang w:eastAsia="en-GB"/>
+                <w14:ligatures w14:val="none"/>
+              </w:rPr>
+              <w:t xml:space="preserve"> sizes</w:t>
+            </w:r>
+            <w:r>
+              <w:rPr>
+                <w:rFonts w:eastAsia="Times New Roman" w:cs="Times New Roman"/>
+                <w:color w:val="000000"/>
+                <w:kern w:val="0"/>
+                <w:sz w:val="15"/>
+                <w:szCs w:val="15"/>
+                <w:lang w:eastAsia="en-GB"/>
+                <w14:ligatures w14:val="none"/>
+              </w:rPr>
+              <w:t>.</w:t>
             </w:r>
           </w:p>
         </w:tc>
@@ -1664,19 +1688,31 @@
                 <w:lang w:eastAsia="en-GB"/>
                 <w14:ligatures w14:val="none"/>
               </w:rPr>
-              <w:t>C</w:t>
-            </w:r>
-            <w:r>
-              <w:rPr>
-                <w:rFonts w:eastAsia="Times New Roman" w:cs="Times New Roman"/>
-                <w:color w:val="000000"/>
-                <w:kern w:val="0"/>
-                <w:sz w:val="15"/>
-                <w:szCs w:val="15"/>
-                <w:lang w:eastAsia="en-GB"/>
-                <w14:ligatures w14:val="none"/>
-              </w:rPr>
-              <w:t>ut back.</w:t>
+              <w:t>Maybe c</w:t>
+            </w:r>
+            <w:r>
+              <w:rPr>
+                <w:rFonts w:eastAsia="Times New Roman" w:cs="Times New Roman"/>
+                <w:color w:val="000000"/>
+                <w:kern w:val="0"/>
+                <w:sz w:val="15"/>
+                <w:szCs w:val="15"/>
+                <w:lang w:eastAsia="en-GB"/>
+                <w14:ligatures w14:val="none"/>
+              </w:rPr>
+              <w:t>ut back</w:t>
+            </w:r>
+            <w:r>
+              <w:rPr>
+                <w:rFonts w:eastAsia="Times New Roman" w:cs="Times New Roman"/>
+                <w:color w:val="000000"/>
+                <w:kern w:val="0"/>
+                <w:sz w:val="15"/>
+                <w:szCs w:val="15"/>
+                <w:lang w:eastAsia="en-GB"/>
+                <w14:ligatures w14:val="none"/>
+              </w:rPr>
+              <w:t>?</w:t>
             </w:r>
           </w:p>
         </w:tc>
@@ -1884,7 +1920,55 @@
                 <w:lang w:eastAsia="en-GB"/>
                 <w14:ligatures w14:val="none"/>
               </w:rPr>
-              <w:t>Risky mix—loaded with sugar/salt/fat</w:t>
+              <w:t xml:space="preserve">Risky mix—loaded with </w:t>
+            </w:r>
+            <w:r>
+              <w:rPr>
+                <w:rFonts w:eastAsia="Times New Roman" w:cs="Times New Roman"/>
+                <w:color w:val="000000"/>
+                <w:kern w:val="0"/>
+                <w:sz w:val="15"/>
+                <w:szCs w:val="15"/>
+                <w:lang w:eastAsia="en-GB"/>
+                <w14:ligatures w14:val="none"/>
+              </w:rPr>
+              <w:t xml:space="preserve">poor quality ingredients. </w:t>
+            </w:r>
+            <w:r>
+              <w:rPr>
+                <w:rFonts w:eastAsia="Times New Roman" w:cs="Times New Roman"/>
+                <w:color w:val="000000"/>
+                <w:kern w:val="0"/>
+                <w:sz w:val="15"/>
+                <w:szCs w:val="15"/>
+                <w:lang w:eastAsia="en-GB"/>
+                <w14:ligatures w14:val="none"/>
+              </w:rPr>
+              <w:t>A</w:t>
+            </w:r>
+            <w:r>
+              <w:rPr>
+                <w:rFonts w:eastAsia="Times New Roman" w:cs="Times New Roman"/>
+                <w:color w:val="000000"/>
+                <w:kern w:val="0"/>
+                <w:sz w:val="15"/>
+                <w:szCs w:val="15"/>
+                <w:lang w:eastAsia="en-GB"/>
+                <w14:ligatures w14:val="none"/>
+              </w:rPr>
+              <w:t>void</w:t>
+            </w:r>
+            <w:r>
+              <w:rPr>
+                <w:rFonts w:eastAsia="Times New Roman" w:cs="Times New Roman"/>
+                <w:color w:val="000000"/>
+                <w:kern w:val="0"/>
+                <w:sz w:val="15"/>
+                <w:szCs w:val="15"/>
+                <w:lang w:eastAsia="en-GB"/>
+                <w14:ligatures w14:val="none"/>
+              </w:rPr>
+              <w:t xml:space="preserve"> if possible</w:t>
             </w:r>
             <w:r>
               <w:rPr>
@@ -1897,42 +1981,6 @@
                 <w14:ligatures w14:val="none"/>
               </w:rPr>
               <w:t>.</w:t>
-            </w:r>
-            <w:r>
-              <w:rPr>
-                <w:rFonts w:eastAsia="Times New Roman" w:cs="Times New Roman"/>
-                <w:color w:val="000000"/>
-                <w:kern w:val="0"/>
-                <w:sz w:val="15"/>
-                <w:szCs w:val="15"/>
-                <w:lang w:eastAsia="en-GB"/>
-                <w14:ligatures w14:val="none"/>
-              </w:rPr>
-              <w:t xml:space="preserve"> </w:t>
-            </w:r>
-            <w:r>
-              <w:rPr>
-                <w:rFonts w:eastAsia="Times New Roman" w:cs="Times New Roman"/>
-                <w:color w:val="000000"/>
-                <w:kern w:val="0"/>
-                <w:sz w:val="15"/>
-                <w:szCs w:val="15"/>
-                <w:lang w:eastAsia="en-GB"/>
-                <w14:ligatures w14:val="none"/>
-              </w:rPr>
-              <w:t>A</w:t>
-            </w:r>
-            <w:r>
-              <w:rPr>
-                <w:rFonts w:eastAsia="Times New Roman" w:cs="Times New Roman"/>
-                <w:color w:val="000000"/>
-                <w:kern w:val="0"/>
-                <w:sz w:val="15"/>
-                <w:szCs w:val="15"/>
-                <w:lang w:eastAsia="en-GB"/>
-                <w14:ligatures w14:val="none"/>
-              </w:rPr>
-              <w:t>void often.</w:t>
             </w:r>
           </w:p>
         </w:tc>
@@ -2435,43 +2483,7 @@
                 <w:lang w:eastAsia="en-GB"/>
                 <w14:ligatures w14:val="none"/>
               </w:rPr>
-              <w:t xml:space="preserve">extracted from </w:t>
-            </w:r>
-            <w:r>
-              <w:rPr>
-                <w:rFonts w:eastAsia="Times New Roman" w:cs="Times New Roman"/>
-                <w:color w:val="000000"/>
-                <w:kern w:val="0"/>
-                <w:sz w:val="15"/>
-                <w:szCs w:val="15"/>
-                <w:lang w:eastAsia="en-GB"/>
-                <w14:ligatures w14:val="none"/>
-              </w:rPr>
-              <w:t>natural</w:t>
-            </w:r>
-            <w:r>
-              <w:rPr>
-                <w:rFonts w:eastAsia="Times New Roman" w:cs="Times New Roman"/>
-                <w:color w:val="000000"/>
-                <w:kern w:val="0"/>
-                <w:sz w:val="15"/>
-                <w:szCs w:val="15"/>
-                <w:lang w:eastAsia="en-GB"/>
-                <w14:ligatures w14:val="none"/>
-              </w:rPr>
-              <w:t xml:space="preserve"> foods or derived from nature, used to season and cook</w:t>
-            </w:r>
-            <w:r>
-              <w:rPr>
-                <w:rFonts w:eastAsia="Times New Roman" w:cs="Times New Roman"/>
-                <w:color w:val="000000"/>
-                <w:kern w:val="0"/>
-                <w:sz w:val="15"/>
-                <w:szCs w:val="15"/>
-                <w:lang w:eastAsia="en-GB"/>
-                <w14:ligatures w14:val="none"/>
-              </w:rPr>
-              <w:t>.</w:t>
+              <w:t>extracted from natural foods or derived from nature, used to season and cook.</w:t>
             </w:r>
           </w:p>
         </w:tc>
@@ -3308,28 +3320,7 @@
                 <w:sz w:val="15"/>
                 <w:szCs w:val="15"/>
               </w:rPr>
-              <w:t>[insert flagged additive(s)</w:t>
-            </w:r>
-            <w:r>
-              <w:rPr>
-                <w:sz w:val="15"/>
-                <w:szCs w:val="15"/>
-              </w:rPr>
-              <w:t>/irritant(s)</w:t>
-            </w:r>
-            <w:r>
-              <w:rPr>
-                <w:sz w:val="15"/>
-                <w:szCs w:val="15"/>
-              </w:rPr>
-              <w:t>]</w:t>
-            </w:r>
-            <w:r>
-              <w:rPr>
-                <w:sz w:val="15"/>
-                <w:szCs w:val="15"/>
-              </w:rPr>
-              <w:t xml:space="preserve"> </w:t>
+              <w:t xml:space="preserve">[insert flagged additive(s)/irritant(s)] </w:t>
             </w:r>
             <w:r>
               <w:rPr>
@@ -3593,40 +3584,43 @@
                 <w:sz w:val="15"/>
                 <w:szCs w:val="15"/>
               </w:rPr>
-              <w:t>[insert flagged additive(s)</w:t>
-            </w:r>
-            <w:r>
-              <w:rPr>
-                <w:sz w:val="15"/>
-                <w:szCs w:val="15"/>
-              </w:rPr>
-              <w:t>/irritant(s)</w:t>
-            </w:r>
-            <w:r>
-              <w:rPr>
-                <w:sz w:val="15"/>
-                <w:szCs w:val="15"/>
-              </w:rPr>
-              <w:t>]</w:t>
-            </w:r>
-            <w:r>
-              <w:rPr>
-                <w:sz w:val="15"/>
-                <w:szCs w:val="15"/>
-              </w:rPr>
-              <w:t xml:space="preserve"> </w:t>
-            </w:r>
-            <w:r>
-              <w:rPr>
-                <w:rFonts w:eastAsia="Times New Roman" w:cs="Times New Roman"/>
-                <w:color w:val="000000"/>
-                <w:kern w:val="0"/>
-                <w:sz w:val="15"/>
-                <w:szCs w:val="15"/>
-                <w:lang w:eastAsia="en-GB"/>
-                <w14:ligatures w14:val="none"/>
-              </w:rPr>
-              <w:t>Many additives are considered safe in small quantities for the general population and are vital for food preservation (preventing spoilage and bacterial growth). However, caution is advised for certain individuals (e.g., those with allergies or sensitivities).</w:t>
+              <w:t xml:space="preserve">[insert flagged additive(s)/irritant(s)] </w:t>
+            </w:r>
+            <w:r>
+              <w:rPr>
+                <w:rFonts w:eastAsia="Times New Roman" w:cs="Times New Roman"/>
+                <w:color w:val="000000"/>
+                <w:kern w:val="0"/>
+                <w:sz w:val="15"/>
+                <w:szCs w:val="15"/>
+                <w:lang w:eastAsia="en-GB"/>
+                <w14:ligatures w14:val="none"/>
+              </w:rPr>
+              <w:t xml:space="preserve">Many additives are considered safe in small quantities for the general population and are vital for food preservation (preventing spoilage and bacterial growth). However, caution is advised for certain individuals (e.g., </w:t>
+            </w:r>
+            <w:r>
+              <w:rPr>
+                <w:rFonts w:eastAsia="Times New Roman" w:cs="Times New Roman"/>
+                <w:color w:val="000000"/>
+                <w:kern w:val="0"/>
+                <w:sz w:val="15"/>
+                <w:szCs w:val="15"/>
+                <w:lang w:eastAsia="en-GB"/>
+                <w14:ligatures w14:val="none"/>
+              </w:rPr>
+              <w:t xml:space="preserve">possibly </w:t>
+            </w:r>
+            <w:r>
+              <w:rPr>
+                <w:rFonts w:eastAsia="Times New Roman" w:cs="Times New Roman"/>
+                <w:color w:val="000000"/>
+                <w:kern w:val="0"/>
+                <w:sz w:val="15"/>
+                <w:szCs w:val="15"/>
+                <w:lang w:eastAsia="en-GB"/>
+                <w14:ligatures w14:val="none"/>
+              </w:rPr>
+              <w:t>those with allergies or sensitivities).</w:t>
             </w:r>
           </w:p>
         </w:tc>
@@ -3853,28 +3847,7 @@
                 <w:sz w:val="15"/>
                 <w:szCs w:val="15"/>
               </w:rPr>
-              <w:t>[insert flagged additive(s)</w:t>
-            </w:r>
-            <w:r>
-              <w:rPr>
-                <w:sz w:val="15"/>
-                <w:szCs w:val="15"/>
-              </w:rPr>
-              <w:t>/irritant(s)</w:t>
-            </w:r>
-            <w:r>
-              <w:rPr>
-                <w:sz w:val="15"/>
-                <w:szCs w:val="15"/>
-              </w:rPr>
-              <w:t>]</w:t>
-            </w:r>
-            <w:r>
-              <w:rPr>
-                <w:sz w:val="15"/>
-                <w:szCs w:val="15"/>
-              </w:rPr>
-              <w:t xml:space="preserve"> </w:t>
+              <w:t xml:space="preserve">[insert flagged additive(s)/irritant(s)] </w:t>
             </w:r>
             <w:r>
               <w:rPr>
@@ -4113,28 +4086,7 @@
                 <w:sz w:val="15"/>
                 <w:szCs w:val="15"/>
               </w:rPr>
-              <w:t>[insert flagged additive(s)</w:t>
-            </w:r>
-            <w:r>
-              <w:rPr>
-                <w:sz w:val="15"/>
-                <w:szCs w:val="15"/>
-              </w:rPr>
-              <w:t>/irritant(s)</w:t>
-            </w:r>
-            <w:r>
-              <w:rPr>
-                <w:sz w:val="15"/>
-                <w:szCs w:val="15"/>
-              </w:rPr>
-              <w:t>]</w:t>
-            </w:r>
-            <w:r>
-              <w:rPr>
-                <w:sz w:val="15"/>
-                <w:szCs w:val="15"/>
-              </w:rPr>
-              <w:t xml:space="preserve"> </w:t>
+              <w:t xml:space="preserve">[insert flagged additive(s)/irritant(s)] </w:t>
             </w:r>
             <w:r>
               <w:rPr>
@@ -4195,6 +4147,18 @@
                 <w14:ligatures w14:val="none"/>
               </w:rPr>
               <w:t>/intake</w:t>
+            </w:r>
+            <w:r>
+              <w:rPr>
+                <w:rFonts w:eastAsia="Times New Roman" w:cs="Times New Roman"/>
+                <w:color w:val="000000"/>
+                <w:kern w:val="0"/>
+                <w:sz w:val="15"/>
+                <w:szCs w:val="15"/>
+                <w:lang w:eastAsia="en-GB"/>
+                <w14:ligatures w14:val="none"/>
+              </w:rPr>
+              <w:t xml:space="preserve"> if possible</w:t>
             </w:r>
             <w:r>
               <w:rPr>
@@ -4452,40 +4416,19 @@
                 <w:sz w:val="15"/>
                 <w:szCs w:val="15"/>
               </w:rPr>
-              <w:t>[insert flagged additive(s)</w:t>
-            </w:r>
-            <w:r>
-              <w:rPr>
-                <w:sz w:val="15"/>
-                <w:szCs w:val="15"/>
-              </w:rPr>
-              <w:t>/irritant(s)</w:t>
-            </w:r>
-            <w:r>
-              <w:rPr>
-                <w:sz w:val="15"/>
-                <w:szCs w:val="15"/>
-              </w:rPr>
-              <w:t>]</w:t>
-            </w:r>
-            <w:r>
-              <w:rPr>
-                <w:sz w:val="15"/>
-                <w:szCs w:val="15"/>
-              </w:rPr>
-              <w:t xml:space="preserve"> </w:t>
-            </w:r>
-            <w:r>
-              <w:rPr>
-                <w:rFonts w:eastAsia="Times New Roman" w:cs="Times New Roman"/>
-                <w:color w:val="000000"/>
-                <w:kern w:val="0"/>
-                <w:sz w:val="15"/>
-                <w:szCs w:val="15"/>
-                <w:lang w:eastAsia="en-GB"/>
-                <w14:ligatures w14:val="none"/>
-              </w:rPr>
-              <w:t xml:space="preserve">Probable cancer risk.  </w:t>
+              <w:t>[insert flagged additive(s)/irritant(s)]</w:t>
+            </w:r>
+            <w:r>
+              <w:rPr>
+                <w:rFonts w:eastAsia="Times New Roman" w:cs="Times New Roman"/>
+                <w:color w:val="000000"/>
+                <w:kern w:val="0"/>
+                <w:sz w:val="15"/>
+                <w:szCs w:val="15"/>
+                <w:lang w:eastAsia="en-GB"/>
+                <w14:ligatures w14:val="none"/>
+              </w:rPr>
+              <w:t xml:space="preserve">.  </w:t>
             </w:r>
             <w:r>
               <w:rPr>
@@ -4533,19 +4476,7 @@
                 <w:lang w:eastAsia="en-GB"/>
                 <w14:ligatures w14:val="none"/>
               </w:rPr>
-              <w:t xml:space="preserve"> of consumption levels</w:t>
-            </w:r>
-            <w:r>
-              <w:rPr>
-                <w:rFonts w:eastAsia="Times New Roman" w:cs="Times New Roman"/>
-                <w:color w:val="000000"/>
-                <w:kern w:val="0"/>
-                <w:sz w:val="15"/>
-                <w:szCs w:val="15"/>
-                <w:lang w:eastAsia="en-GB"/>
-                <w14:ligatures w14:val="none"/>
-              </w:rPr>
-              <w:t>.</w:t>
+              <w:t xml:space="preserve"> of consumption levels.</w:t>
             </w:r>
           </w:p>
         </w:tc>
@@ -4772,79 +4703,31 @@
                 <w:lang w:eastAsia="en-GB"/>
                 <w14:ligatures w14:val="none"/>
               </w:rPr>
-              <w:t>I</w:t>
-            </w:r>
-            <w:r>
-              <w:rPr>
-                <w:rFonts w:eastAsia="Times New Roman" w:cs="Times New Roman"/>
-                <w:color w:val="000000"/>
-                <w:kern w:val="0"/>
-                <w:sz w:val="15"/>
-                <w:szCs w:val="15"/>
-                <w:lang w:eastAsia="en-GB"/>
-                <w14:ligatures w14:val="none"/>
-              </w:rPr>
-              <w:t>ndicates significant concerns related to potential health hazards from nutrition, ingredients, and processing</w:t>
-            </w:r>
-            <w:r>
-              <w:rPr>
-                <w:rFonts w:eastAsia="Times New Roman" w:cs="Times New Roman"/>
-                <w:color w:val="000000"/>
-                <w:kern w:val="0"/>
-                <w:sz w:val="15"/>
-                <w:szCs w:val="15"/>
-                <w:lang w:eastAsia="en-GB"/>
-                <w14:ligatures w14:val="none"/>
-              </w:rPr>
-              <w:t xml:space="preserve"> including use of pesticides</w:t>
-            </w:r>
-            <w:r>
-              <w:rPr>
-                <w:rFonts w:eastAsia="Times New Roman" w:cs="Times New Roman"/>
-                <w:color w:val="000000"/>
-                <w:kern w:val="0"/>
-                <w:sz w:val="15"/>
-                <w:szCs w:val="15"/>
-                <w:lang w:eastAsia="en-GB"/>
-                <w14:ligatures w14:val="none"/>
-              </w:rPr>
-              <w:t>.</w:t>
-            </w:r>
-            <w:r>
-              <w:rPr>
-                <w:rFonts w:eastAsia="Times New Roman" w:cs="Times New Roman"/>
-                <w:color w:val="000000"/>
-                <w:kern w:val="0"/>
-                <w:sz w:val="15"/>
-                <w:szCs w:val="15"/>
-                <w:lang w:eastAsia="en-GB"/>
-                <w14:ligatures w14:val="none"/>
-              </w:rPr>
-              <w:t xml:space="preserve"> Limit risk by </w:t>
-            </w:r>
-            <w:r>
-              <w:rPr>
-                <w:rFonts w:eastAsia="Times New Roman" w:cs="Times New Roman"/>
-                <w:color w:val="000000"/>
-                <w:kern w:val="0"/>
-                <w:sz w:val="15"/>
-                <w:szCs w:val="15"/>
-                <w:lang w:eastAsia="en-GB"/>
-                <w14:ligatures w14:val="none"/>
-              </w:rPr>
-              <w:t>choosing organic options</w:t>
-            </w:r>
-            <w:r>
-              <w:rPr>
-                <w:rFonts w:eastAsia="Times New Roman" w:cs="Times New Roman"/>
-                <w:color w:val="000000"/>
-                <w:kern w:val="0"/>
-                <w:sz w:val="15"/>
-                <w:szCs w:val="15"/>
-                <w:lang w:eastAsia="en-GB"/>
-                <w14:ligatures w14:val="none"/>
-              </w:rPr>
-              <w:t>.</w:t>
+              <w:t>Indicates significant concerns related to potential health hazards from nutrition, ingredients, and processing including use of pesticides. Limit risk by choosing o</w:t>
+            </w:r>
+            <w:r>
+              <w:rPr>
+                <w:rFonts w:eastAsia="Times New Roman" w:cs="Times New Roman"/>
+                <w:color w:val="000000"/>
+                <w:kern w:val="0"/>
+                <w:sz w:val="15"/>
+                <w:szCs w:val="15"/>
+                <w:lang w:eastAsia="en-GB"/>
+                <w14:ligatures w14:val="none"/>
+              </w:rPr>
+              <w:t>ther</w:t>
+            </w:r>
+            <w:r>
+              <w:rPr>
+                <w:rFonts w:eastAsia="Times New Roman" w:cs="Times New Roman"/>
+                <w:color w:val="000000"/>
+                <w:kern w:val="0"/>
+                <w:sz w:val="15"/>
+                <w:szCs w:val="15"/>
+                <w:lang w:eastAsia="en-GB"/>
+                <w14:ligatures w14:val="none"/>
+              </w:rPr>
+              <w:t xml:space="preserve"> options.</w:t>
             </w:r>
           </w:p>
         </w:tc>
@@ -5071,14 +4954,7 @@
                 <w:sz w:val="15"/>
                 <w:szCs w:val="15"/>
               </w:rPr>
-              <w:t>[insert flagged additive(s)/irritant(s)]</w:t>
-            </w:r>
-            <w:r>
-              <w:rPr>
-                <w:sz w:val="15"/>
-                <w:szCs w:val="15"/>
-              </w:rPr>
-              <w:t xml:space="preserve">.  </w:t>
+              <w:t xml:space="preserve">[insert flagged additive(s)/irritant(s)].  </w:t>
             </w:r>
             <w:r>
               <w:rPr>
@@ -7403,14 +7279,7 @@
                 <w:sz w:val="15"/>
                 <w:szCs w:val="15"/>
               </w:rPr>
-              <w:t>Low impact</w:t>
-            </w:r>
-            <w:r>
-              <w:rPr>
-                <w:sz w:val="15"/>
-                <w:szCs w:val="15"/>
-              </w:rPr>
-              <w:t xml:space="preserve"> (origins_tags crop filter; high-water/carbon/land/crop treatment)</w:t>
+              <w:t>Low impact (origins_tags crop filter; high-water/carbon/land/crop treatment)</w:t>
             </w:r>
           </w:p>
         </w:tc>
@@ -7554,21 +7423,7 @@
                 <w:sz w:val="15"/>
                 <w:szCs w:val="15"/>
               </w:rPr>
-              <w:t xml:space="preserve">Brand/parent </w:t>
-            </w:r>
-            <w:r>
-              <w:rPr>
-                <w:sz w:val="15"/>
-                <w:szCs w:val="15"/>
-              </w:rPr>
-              <w:t>high impact</w:t>
-            </w:r>
-            <w:r>
-              <w:rPr>
-                <w:sz w:val="15"/>
-                <w:szCs w:val="15"/>
-              </w:rPr>
-              <w:t xml:space="preserve"> (overlay)</w:t>
+              <w:t>Brand/parent high impact (overlay)</w:t>
             </w:r>
           </w:p>
         </w:tc>
@@ -7747,21 +7602,7 @@
                 <w:sz w:val="15"/>
                 <w:szCs w:val="15"/>
               </w:rPr>
-              <w:t xml:space="preserve">High-water/carbon/land/crop treatment (e.g., strawberries if origins match </w:t>
-            </w:r>
-            <w:r>
-              <w:rPr>
-                <w:sz w:val="15"/>
-                <w:szCs w:val="15"/>
-              </w:rPr>
-              <w:t>high residue</w:t>
-            </w:r>
-            <w:r>
-              <w:rPr>
-                <w:sz w:val="15"/>
-                <w:szCs w:val="15"/>
-              </w:rPr>
-              <w:t>; deduct eco-only)</w:t>
+              <w:t>High-water/carbon/land/crop treatment (e.g., strawberries if origins match high residue; deduct eco-only)</w:t>
             </w:r>
           </w:p>
         </w:tc>
@@ -8577,14 +8418,7 @@
                 <w:sz w:val="15"/>
                 <w:szCs w:val="15"/>
               </w:rPr>
-              <w:t xml:space="preserve">  Certified Organic registered with </w:t>
-            </w:r>
-            <w:r>
-              <w:rPr>
-                <w:sz w:val="15"/>
-                <w:szCs w:val="15"/>
-              </w:rPr>
-              <w:t>[insert certification agency(s)]</w:t>
+              <w:t xml:space="preserve">  Certified Organic registered with [insert certification agency(s)]</w:t>
             </w:r>
             <w:r>
               <w:rPr>
@@ -9954,14 +9788,7 @@
                 <w:sz w:val="15"/>
                 <w:szCs w:val="15"/>
               </w:rPr>
-              <w:t>of</w:t>
-            </w:r>
-            <w:r>
-              <w:rPr>
-                <w:sz w:val="15"/>
-                <w:szCs w:val="15"/>
-              </w:rPr>
-              <w:t xml:space="preserve"> safe, traceable, and sustainably produced food</w:t>
+              <w:t>of safe, traceable, and sustainably produced food</w:t>
             </w:r>
             <w:r>
               <w:rPr>
@@ -10933,14 +10760,7 @@
                 <w:sz w:val="15"/>
                 <w:szCs w:val="15"/>
               </w:rPr>
-              <w:t>.</w:t>
-            </w:r>
-            <w:r>
-              <w:rPr>
-                <w:sz w:val="15"/>
-                <w:szCs w:val="15"/>
-              </w:rPr>
-              <w:t xml:space="preserve"> Tier </w:t>
+              <w:t xml:space="preserve">. Tier </w:t>
             </w:r>
             <w:r>
               <w:rPr>
@@ -11143,14 +10963,7 @@
                 <w:sz w:val="15"/>
                 <w:szCs w:val="15"/>
               </w:rPr>
-              <w:t xml:space="preserve">. </w:t>
-            </w:r>
-            <w:r>
-              <w:rPr>
-                <w:sz w:val="15"/>
-                <w:szCs w:val="15"/>
-              </w:rPr>
-              <w:t>This company is currently classified as Tier 6 meaning that t</w:t>
+              <w:t>. This company is currently classified as Tier 6 meaning that t</w:t>
             </w:r>
             <w:r>
               <w:rPr>
@@ -11304,21 +11117,7 @@
                 <w:sz w:val="15"/>
                 <w:szCs w:val="15"/>
               </w:rPr>
-              <w:t xml:space="preserve">No evidence that this company makes </w:t>
-            </w:r>
-            <w:r>
-              <w:rPr>
-                <w:sz w:val="15"/>
-                <w:szCs w:val="15"/>
-              </w:rPr>
-              <w:t xml:space="preserve">improving </w:t>
-            </w:r>
-            <w:r>
-              <w:rPr>
-                <w:sz w:val="15"/>
-                <w:szCs w:val="15"/>
-              </w:rPr>
-              <w:t>animal welfare a business priority.</w:t>
+              <w:t>No evidence that this company makes improving animal welfare a business priority.</w:t>
             </w:r>
             <w:r>
               <w:t xml:space="preserve"> </w:t>
@@ -11443,21 +11242,7 @@
                 <w:sz w:val="15"/>
                 <w:szCs w:val="15"/>
               </w:rPr>
-              <w:t xml:space="preserve">Limited Concerns: Isolated Labor/worker rights lapse </w:t>
-            </w:r>
-            <w:r>
-              <w:rPr>
-                <w:sz w:val="15"/>
-                <w:szCs w:val="15"/>
-              </w:rPr>
-              <w:t>e.g. under-pay/over-work</w:t>
-            </w:r>
-            <w:r>
-              <w:rPr>
-                <w:sz w:val="15"/>
-                <w:szCs w:val="15"/>
-              </w:rPr>
-              <w:t xml:space="preserve"> at Product level.</w:t>
+              <w:t>Limited Concerns: Isolated Labor/worker rights lapse e.g. under-pay/over-work at Product level.</w:t>
             </w:r>
           </w:p>
         </w:tc>
@@ -11944,28 +11729,7 @@
                 <w:sz w:val="15"/>
                 <w:szCs w:val="15"/>
               </w:rPr>
-              <w:t>Moderate</w:t>
-            </w:r>
-            <w:r>
-              <w:rPr>
-                <w:sz w:val="15"/>
-                <w:szCs w:val="15"/>
-              </w:rPr>
-              <w:t xml:space="preserve"> Concerns: e.g. </w:t>
-            </w:r>
-            <w:r>
-              <w:rPr>
-                <w:sz w:val="15"/>
-                <w:szCs w:val="15"/>
-              </w:rPr>
-              <w:t>unsafe conditions violations</w:t>
-            </w:r>
-            <w:r>
-              <w:rPr>
-                <w:sz w:val="15"/>
-                <w:szCs w:val="15"/>
-              </w:rPr>
-              <w:t xml:space="preserve"> at Product level.</w:t>
+              <w:t>Moderate Concerns: e.g. unsafe conditions violations at Product level.</w:t>
             </w:r>
           </w:p>
         </w:tc>
@@ -12197,35 +11961,14 @@
                 <w:sz w:val="15"/>
                 <w:szCs w:val="15"/>
               </w:rPr>
-              <w:t>Significant</w:t>
-            </w:r>
-            <w:r>
-              <w:rPr>
-                <w:sz w:val="15"/>
-                <w:szCs w:val="15"/>
-              </w:rPr>
-              <w:t xml:space="preserve"> </w:t>
-            </w:r>
-            <w:r>
-              <w:rPr>
-                <w:sz w:val="15"/>
-                <w:szCs w:val="15"/>
-              </w:rPr>
-              <w:t>L</w:t>
-            </w:r>
-            <w:r>
-              <w:rPr>
-                <w:sz w:val="15"/>
-                <w:szCs w:val="15"/>
-              </w:rPr>
-              <w:t>abor</w:t>
-            </w:r>
-            <w:r>
-              <w:rPr>
-                <w:sz w:val="15"/>
-                <w:szCs w:val="15"/>
-              </w:rPr>
-              <w:t xml:space="preserve"> violations identified</w:t>
+              <w:t>Significant L</w:t>
+            </w:r>
+            <w:r>
+              <w:rPr>
+                <w:sz w:val="15"/>
+                <w:szCs w:val="15"/>
+              </w:rPr>
+              <w:t>abor violations identified</w:t>
             </w:r>
             <w:r>
               <w:rPr>
@@ -12295,21 +12038,7 @@
                 <w:sz w:val="15"/>
                 <w:szCs w:val="15"/>
               </w:rPr>
-              <w:t xml:space="preserve"> </w:t>
-            </w:r>
-            <w:r>
-              <w:rPr>
-                <w:sz w:val="15"/>
-                <w:szCs w:val="15"/>
-              </w:rPr>
-              <w:t>Labor</w:t>
-            </w:r>
-            <w:r>
-              <w:rPr>
-                <w:sz w:val="15"/>
-                <w:szCs w:val="15"/>
-              </w:rPr>
-              <w:t xml:space="preserve"> violations</w:t>
+              <w:t xml:space="preserve"> Labor violations</w:t>
             </w:r>
             <w:r>
               <w:rPr>
@@ -12441,28 +12170,7 @@
                 <w:sz w:val="15"/>
                 <w:szCs w:val="15"/>
               </w:rPr>
-              <w:t>Major</w:t>
-            </w:r>
-            <w:r>
-              <w:rPr>
-                <w:sz w:val="15"/>
-                <w:szCs w:val="15"/>
-              </w:rPr>
-              <w:t xml:space="preserve"> Concerns: e.g., child </w:t>
-            </w:r>
-            <w:r>
-              <w:rPr>
-                <w:sz w:val="15"/>
-                <w:szCs w:val="15"/>
-              </w:rPr>
-              <w:t>Labor</w:t>
-            </w:r>
-            <w:r>
-              <w:rPr>
-                <w:sz w:val="15"/>
-                <w:szCs w:val="15"/>
-              </w:rPr>
-              <w:t>/slavery at Product level.</w:t>
+              <w:t>Major Concerns: e.g., child Labor/slavery at Product level.</w:t>
             </w:r>
           </w:p>
         </w:tc>
@@ -12540,35 +12248,7 @@
                 <w:sz w:val="15"/>
                 <w:szCs w:val="15"/>
               </w:rPr>
-              <w:t xml:space="preserve">Significant </w:t>
-            </w:r>
-            <w:r>
-              <w:rPr>
-                <w:sz w:val="15"/>
-                <w:szCs w:val="15"/>
-              </w:rPr>
-              <w:t>Labor</w:t>
-            </w:r>
-            <w:r>
-              <w:rPr>
-                <w:sz w:val="15"/>
-                <w:szCs w:val="15"/>
-              </w:rPr>
-              <w:t xml:space="preserve"> </w:t>
-            </w:r>
-            <w:r>
-              <w:rPr>
-                <w:sz w:val="15"/>
-                <w:szCs w:val="15"/>
-              </w:rPr>
-              <w:t>and human exploitation</w:t>
-            </w:r>
-            <w:r>
-              <w:rPr>
-                <w:sz w:val="15"/>
-                <w:szCs w:val="15"/>
-              </w:rPr>
-              <w:t xml:space="preserve"> violations were flagged for this product.  </w:t>
+              <w:t xml:space="preserve">Significant Labor and human exploitation violations were flagged for this product.  </w:t>
             </w:r>
             <w:r>
               <w:rPr>
@@ -12799,21 +12479,7 @@
                 <w:sz w:val="15"/>
                 <w:szCs w:val="15"/>
               </w:rPr>
-              <w:t xml:space="preserve"> </w:t>
-            </w:r>
-            <w:r>
-              <w:rPr>
-                <w:sz w:val="15"/>
-                <w:szCs w:val="15"/>
-              </w:rPr>
-              <w:t>Labor</w:t>
-            </w:r>
-            <w:r>
-              <w:rPr>
-                <w:sz w:val="15"/>
-                <w:szCs w:val="15"/>
-              </w:rPr>
-              <w:t xml:space="preserve"> violations</w:t>
+              <w:t xml:space="preserve"> Labor violations</w:t>
             </w:r>
             <w:r>
               <w:rPr>
@@ -13111,49 +12777,7 @@
                 <w:sz w:val="15"/>
                 <w:szCs w:val="15"/>
               </w:rPr>
-              <w:t xml:space="preserve"> </w:t>
-            </w:r>
-            <w:r>
-              <w:rPr>
-                <w:sz w:val="15"/>
-                <w:szCs w:val="15"/>
-              </w:rPr>
-              <w:t xml:space="preserve">Click </w:t>
-            </w:r>
-            <w:r>
-              <w:rPr>
-                <w:sz w:val="15"/>
-                <w:szCs w:val="15"/>
-              </w:rPr>
-              <w:t>&lt;</w:t>
-            </w:r>
-            <w:r>
-              <w:rPr>
-                <w:sz w:val="15"/>
-                <w:szCs w:val="15"/>
-              </w:rPr>
-              <w:t>here</w:t>
-            </w:r>
-            <w:r>
-              <w:rPr>
-                <w:sz w:val="15"/>
-                <w:szCs w:val="15"/>
-              </w:rPr>
-              <w:t>&gt;</w:t>
-            </w:r>
-            <w:r>
-              <w:rPr>
-                <w:sz w:val="15"/>
-                <w:szCs w:val="15"/>
-              </w:rPr>
-              <w:t xml:space="preserve"> for more.</w:t>
-            </w:r>
-            <w:r>
-              <w:rPr>
-                <w:sz w:val="15"/>
-                <w:szCs w:val="15"/>
-              </w:rPr>
-              <w:t xml:space="preserve"> [insert recall alert hyperlink]</w:t>
+              <w:t xml:space="preserve"> Click &lt;here&gt; for more. [insert recall alert hyperlink]</w:t>
             </w:r>
           </w:p>
         </w:tc>
@@ -13410,21 +13034,7 @@
                 <w:sz w:val="15"/>
                 <w:szCs w:val="15"/>
               </w:rPr>
-              <w:t>Click here for more.</w:t>
-            </w:r>
-            <w:r>
-              <w:rPr>
-                <w:sz w:val="15"/>
-                <w:szCs w:val="15"/>
-              </w:rPr>
-              <w:t xml:space="preserve"> </w:t>
-            </w:r>
-            <w:r>
-              <w:rPr>
-                <w:sz w:val="15"/>
-                <w:szCs w:val="15"/>
-              </w:rPr>
-              <w:t>[insert recall alert hyperlink]</w:t>
+              <w:t>Click here for more. [insert recall alert hyperlink]</w:t>
             </w:r>
           </w:p>
         </w:tc>
@@ -13599,21 +13209,7 @@
                 <w:sz w:val="15"/>
                 <w:szCs w:val="15"/>
               </w:rPr>
-              <w:t>Click here for more.</w:t>
-            </w:r>
-            <w:r>
-              <w:rPr>
-                <w:sz w:val="15"/>
-                <w:szCs w:val="15"/>
-              </w:rPr>
-              <w:t xml:space="preserve"> </w:t>
-            </w:r>
-            <w:r>
-              <w:rPr>
-                <w:sz w:val="15"/>
-                <w:szCs w:val="15"/>
-              </w:rPr>
-              <w:t>[insert recall alert hyperlink]</w:t>
+              <w:t>Click here for more. [insert recall alert hyperlink]</w:t>
             </w:r>
           </w:p>
         </w:tc>
@@ -14608,14 +14204,7 @@
                 <w:sz w:val="15"/>
                 <w:szCs w:val="15"/>
               </w:rPr>
-              <w:t xml:space="preserve"> identified</w:t>
-            </w:r>
-            <w:r>
-              <w:rPr>
-                <w:sz w:val="15"/>
-                <w:szCs w:val="15"/>
-              </w:rPr>
-              <w:t xml:space="preserve">, but </w:t>
+              <w:t xml:space="preserve"> identified, but </w:t>
             </w:r>
             <w:r>
               <w:rPr>
@@ -15264,14 +14853,7 @@
                 <w:sz w:val="15"/>
                 <w:szCs w:val="15"/>
               </w:rPr>
-              <w:t>[insert hidden term(s)]</w:t>
-            </w:r>
-            <w:r>
-              <w:rPr>
-                <w:sz w:val="15"/>
-                <w:szCs w:val="15"/>
-              </w:rPr>
-              <w:t xml:space="preserve">.  </w:t>
+              <w:t xml:space="preserve">[insert hidden term(s)].  </w:t>
             </w:r>
             <w:r>
               <w:rPr>
@@ -16110,14 +15692,7 @@
                 <w:sz w:val="15"/>
                 <w:szCs w:val="15"/>
               </w:rPr>
-              <w:t xml:space="preserve">No ingredients origins available electronically.  </w:t>
-            </w:r>
-            <w:r>
-              <w:rPr>
-                <w:sz w:val="15"/>
-                <w:szCs w:val="15"/>
-              </w:rPr>
-              <w:t xml:space="preserve">Is it on the packet?  Click </w:t>
+              <w:t xml:space="preserve">No ingredients origins available electronically.  Is it on the packet?  Click </w:t>
             </w:r>
             <w:r>
               <w:rPr>
@@ -16960,6 +16535,7 @@
   <w:style w:type="character" w:default="1" w:styleId="DefaultParagraphFont">
     <w:name w:val="Default Paragraph Font"/>
     <w:uiPriority w:val="1"/>
+    <w:semiHidden/>
     <w:unhideWhenUsed/>
   </w:style>
   <w:style w:type="table" w:default="1" w:styleId="TableNormal">

</xml_diff>